<commit_message>
KnowledgeBase.cs si Aspecte teoretice privind algoritmul (doc)
</commit_message>
<xml_diff>
--- a/Catana_Erhan_1411B.docx
+++ b/Catana_Erhan_1411B.docx
@@ -287,7 +287,10 @@
           <w:lang w:val="ro-RO"/>
         </w:rPr>
       </w:pPr>
-      <w:r>
+    </w:p>
+    <w:p>
+      <w:pPr>
+        <w:ind w:firstLine="720"/>
         <w:rPr>
           <w:rFonts w:ascii="Times New Roman" w:hAnsi="Times New Roman" w:cs="Times New Roman"/>
           <w:b/>
@@ -296,7 +299,16 @@
           <w:szCs w:val="32"/>
           <w:lang w:val="ro-RO"/>
         </w:rPr>
-        <w:lastRenderedPageBreak/>
+      </w:pPr>
+      <w:r>
+        <w:rPr>
+          <w:rFonts w:ascii="Times New Roman" w:hAnsi="Times New Roman" w:cs="Times New Roman"/>
+          <w:b/>
+          <w:bCs/>
+          <w:sz w:val="32"/>
+          <w:szCs w:val="32"/>
+          <w:lang w:val="ro-RO"/>
+        </w:rPr>
         <w:t>Tema proiectului</w:t>
       </w:r>
     </w:p>
@@ -677,6 +689,13 @@
         </w:rPr>
         <w:t>.</w:t>
       </w:r>
+    </w:p>
+    <w:p>
+      <w:pPr>
+        <w:rPr>
+          <w:rFonts w:ascii="Times New Roman" w:hAnsi="Times New Roman" w:cs="Times New Roman"/>
+        </w:rPr>
+      </w:pPr>
     </w:p>
     <w:p>
       <w:pPr>
@@ -694,16 +713,20 @@
         </w:numPr>
         <w:rPr>
           <w:rFonts w:ascii="Times New Roman" w:hAnsi="Times New Roman" w:cs="Times New Roman"/>
-          <w:sz w:val="32"/>
-          <w:szCs w:val="32"/>
-          <w:lang w:val="ro-RO"/>
-        </w:rPr>
-      </w:pPr>
-      <w:r>
-        <w:rPr>
-          <w:rFonts w:ascii="Times New Roman" w:hAnsi="Times New Roman" w:cs="Times New Roman"/>
-          <w:sz w:val="32"/>
-          <w:szCs w:val="32"/>
+          <w:b/>
+          <w:bCs/>
+          <w:sz w:val="28"/>
+          <w:szCs w:val="28"/>
+          <w:lang w:val="ro-RO"/>
+        </w:rPr>
+      </w:pPr>
+      <w:r>
+        <w:rPr>
+          <w:rFonts w:ascii="Times New Roman" w:hAnsi="Times New Roman" w:cs="Times New Roman"/>
+          <w:b/>
+          <w:bCs/>
+          <w:sz w:val="28"/>
+          <w:szCs w:val="28"/>
           <w:lang w:val="ro-RO"/>
         </w:rPr>
         <w:t>Descrierea problemei</w:t>
@@ -777,6 +800,22 @@
         </w:rPr>
         <w:t>Orice triunghi echilateral este și triunghi isoscel.</w:t>
       </w:r>
+    </w:p>
+    <w:p>
+      <w:pPr>
+        <w:rPr>
+          <w:rFonts w:ascii="Times New Roman" w:hAnsi="Times New Roman" w:cs="Times New Roman"/>
+          <w:lang w:val="ro-RO"/>
+        </w:rPr>
+      </w:pPr>
+    </w:p>
+    <w:p>
+      <w:pPr>
+        <w:rPr>
+          <w:rFonts w:ascii="Times New Roman" w:hAnsi="Times New Roman" w:cs="Times New Roman"/>
+          <w:lang w:val="ro-RO"/>
+        </w:rPr>
+      </w:pPr>
     </w:p>
     <w:p>
       <w:pPr>
@@ -795,16 +834,20 @@
         </w:numPr>
         <w:rPr>
           <w:rFonts w:ascii="Times New Roman" w:hAnsi="Times New Roman" w:cs="Times New Roman"/>
-          <w:sz w:val="32"/>
-          <w:szCs w:val="32"/>
-          <w:lang w:val="ro-RO"/>
-        </w:rPr>
-      </w:pPr>
-      <w:r>
-        <w:rPr>
-          <w:rFonts w:ascii="Times New Roman" w:hAnsi="Times New Roman" w:cs="Times New Roman"/>
-          <w:sz w:val="32"/>
-          <w:szCs w:val="32"/>
+          <w:b/>
+          <w:bCs/>
+          <w:sz w:val="28"/>
+          <w:szCs w:val="28"/>
+          <w:lang w:val="ro-RO"/>
+        </w:rPr>
+      </w:pPr>
+      <w:r>
+        <w:rPr>
+          <w:rFonts w:ascii="Times New Roman" w:hAnsi="Times New Roman" w:cs="Times New Roman"/>
+          <w:b/>
+          <w:bCs/>
+          <w:sz w:val="28"/>
+          <w:szCs w:val="28"/>
           <w:lang w:val="ro-RO"/>
         </w:rPr>
         <w:t>Teoremele</w:t>
@@ -812,8 +855,10 @@
       <w:r>
         <w:rPr>
           <w:rFonts w:ascii="Times New Roman" w:hAnsi="Times New Roman" w:cs="Times New Roman"/>
-          <w:sz w:val="32"/>
-          <w:szCs w:val="32"/>
+          <w:b/>
+          <w:bCs/>
+          <w:sz w:val="28"/>
+          <w:szCs w:val="28"/>
           <w:lang w:val="ro-RO"/>
         </w:rPr>
         <w:t xml:space="preserve"> demonstrate</w:t>
@@ -888,26 +933,117 @@
           <w:rFonts w:ascii="Times New Roman" w:hAnsi="Times New Roman" w:cs="Times New Roman"/>
           <w:color w:val="C00000"/>
         </w:rPr>
-        <w:t>n² = (2 * k)² = 4 * k²</w:t>
-      </w:r>
-      <w:r>
-        <w:rPr>
-          <w:rFonts w:ascii="Times New Roman" w:hAnsi="Times New Roman" w:cs="Times New Roman"/>
-          <w:color w:val="C00000"/>
+        <w:t xml:space="preserve">n² = (2 * k)² = 4 * k² </w:t>
+      </w:r>
+      <w:r>
+        <w:rPr>
+          <w:rFonts w:ascii="Times New Roman" w:hAnsi="Times New Roman" w:cs="Times New Roman"/>
+        </w:rPr>
+        <w:t xml:space="preserve">, care </w:t>
+      </w:r>
+      <w:proofErr w:type="spellStart"/>
+      <w:r>
+        <w:rPr>
+          <w:rFonts w:ascii="Times New Roman" w:hAnsi="Times New Roman" w:cs="Times New Roman"/>
+        </w:rPr>
+        <w:t>este</w:t>
+      </w:r>
+      <w:proofErr w:type="spellEnd"/>
+      <w:r>
+        <w:rPr>
+          <w:rFonts w:ascii="Times New Roman" w:hAnsi="Times New Roman" w:cs="Times New Roman"/>
         </w:rPr>
         <w:t xml:space="preserve"> </w:t>
       </w:r>
-      <w:r>
-        <w:rPr>
-          <w:rFonts w:ascii="Times New Roman" w:hAnsi="Times New Roman" w:cs="Times New Roman"/>
-        </w:rPr>
-        <w:t xml:space="preserve">, care </w:t>
-      </w:r>
       <w:proofErr w:type="spellStart"/>
       <w:r>
         <w:rPr>
           <w:rFonts w:ascii="Times New Roman" w:hAnsi="Times New Roman" w:cs="Times New Roman"/>
         </w:rPr>
+        <w:t>multiplu</w:t>
+      </w:r>
+      <w:proofErr w:type="spellEnd"/>
+      <w:r>
+        <w:rPr>
+          <w:rFonts w:ascii="Times New Roman" w:hAnsi="Times New Roman" w:cs="Times New Roman"/>
+        </w:rPr>
+        <w:t xml:space="preserve"> de 2, </w:t>
+      </w:r>
+      <w:proofErr w:type="spellStart"/>
+      <w:r>
+        <w:rPr>
+          <w:rFonts w:ascii="Times New Roman" w:hAnsi="Times New Roman" w:cs="Times New Roman"/>
+        </w:rPr>
+        <w:t>prin</w:t>
+      </w:r>
+      <w:proofErr w:type="spellEnd"/>
+      <w:r>
+        <w:rPr>
+          <w:rFonts w:ascii="Times New Roman" w:hAnsi="Times New Roman" w:cs="Times New Roman"/>
+        </w:rPr>
+        <w:t xml:space="preserve"> </w:t>
+      </w:r>
+      <w:proofErr w:type="spellStart"/>
+      <w:r>
+        <w:rPr>
+          <w:rFonts w:ascii="Times New Roman" w:hAnsi="Times New Roman" w:cs="Times New Roman"/>
+        </w:rPr>
+        <w:t>urmare</w:t>
+      </w:r>
+      <w:proofErr w:type="spellEnd"/>
+      <w:r>
+        <w:rPr>
+          <w:rFonts w:ascii="Times New Roman" w:hAnsi="Times New Roman" w:cs="Times New Roman"/>
+        </w:rPr>
+        <w:t xml:space="preserve">, </w:t>
+      </w:r>
+      <w:proofErr w:type="spellStart"/>
+      <w:r>
+        <w:rPr>
+          <w:rFonts w:ascii="Times New Roman" w:hAnsi="Times New Roman" w:cs="Times New Roman"/>
+        </w:rPr>
+        <w:t>pătratul</w:t>
+      </w:r>
+      <w:proofErr w:type="spellEnd"/>
+      <w:r>
+        <w:rPr>
+          <w:rFonts w:ascii="Times New Roman" w:hAnsi="Times New Roman" w:cs="Times New Roman"/>
+        </w:rPr>
+        <w:t xml:space="preserve"> </w:t>
+      </w:r>
+      <w:proofErr w:type="spellStart"/>
+      <w:r>
+        <w:rPr>
+          <w:rFonts w:ascii="Times New Roman" w:hAnsi="Times New Roman" w:cs="Times New Roman"/>
+        </w:rPr>
+        <w:t>unui</w:t>
+      </w:r>
+      <w:proofErr w:type="spellEnd"/>
+      <w:r>
+        <w:rPr>
+          <w:rFonts w:ascii="Times New Roman" w:hAnsi="Times New Roman" w:cs="Times New Roman"/>
+        </w:rPr>
+        <w:t xml:space="preserve"> </w:t>
+      </w:r>
+      <w:proofErr w:type="spellStart"/>
+      <w:r>
+        <w:rPr>
+          <w:rFonts w:ascii="Times New Roman" w:hAnsi="Times New Roman" w:cs="Times New Roman"/>
+        </w:rPr>
+        <w:t>număr</w:t>
+      </w:r>
+      <w:proofErr w:type="spellEnd"/>
+      <w:r>
+        <w:rPr>
+          <w:rFonts w:ascii="Times New Roman" w:hAnsi="Times New Roman" w:cs="Times New Roman"/>
+        </w:rPr>
+        <w:t xml:space="preserve"> par </w:t>
+      </w:r>
+      <w:proofErr w:type="spellStart"/>
+      <w:r>
+        <w:rPr>
+          <w:rFonts w:ascii="Times New Roman" w:hAnsi="Times New Roman" w:cs="Times New Roman"/>
+        </w:rPr>
         <w:t>este</w:t>
       </w:r>
       <w:proofErr w:type="spellEnd"/>
@@ -915,127 +1051,22 @@
         <w:rPr>
           <w:rFonts w:ascii="Times New Roman" w:hAnsi="Times New Roman" w:cs="Times New Roman"/>
         </w:rPr>
-        <w:t xml:space="preserve"> </w:t>
+        <w:t xml:space="preserve">, de </w:t>
       </w:r>
       <w:proofErr w:type="spellStart"/>
       <w:r>
         <w:rPr>
           <w:rFonts w:ascii="Times New Roman" w:hAnsi="Times New Roman" w:cs="Times New Roman"/>
         </w:rPr>
-        <w:t>multiplu</w:t>
+        <w:t>asemenea</w:t>
       </w:r>
       <w:proofErr w:type="spellEnd"/>
       <w:r>
         <w:rPr>
           <w:rFonts w:ascii="Times New Roman" w:hAnsi="Times New Roman" w:cs="Times New Roman"/>
         </w:rPr>
-        <w:t xml:space="preserve"> de 2, </w:t>
-      </w:r>
-      <w:proofErr w:type="spellStart"/>
-      <w:r>
-        <w:rPr>
-          <w:rFonts w:ascii="Times New Roman" w:hAnsi="Times New Roman" w:cs="Times New Roman"/>
-        </w:rPr>
-        <w:t>prin</w:t>
-      </w:r>
-      <w:proofErr w:type="spellEnd"/>
-      <w:r>
-        <w:rPr>
-          <w:rFonts w:ascii="Times New Roman" w:hAnsi="Times New Roman" w:cs="Times New Roman"/>
-        </w:rPr>
-        <w:t xml:space="preserve"> </w:t>
-      </w:r>
-      <w:proofErr w:type="spellStart"/>
-      <w:r>
-        <w:rPr>
-          <w:rFonts w:ascii="Times New Roman" w:hAnsi="Times New Roman" w:cs="Times New Roman"/>
-        </w:rPr>
-        <w:t>urmare</w:t>
-      </w:r>
-      <w:proofErr w:type="spellEnd"/>
-      <w:r>
-        <w:rPr>
-          <w:rFonts w:ascii="Times New Roman" w:hAnsi="Times New Roman" w:cs="Times New Roman"/>
-        </w:rPr>
-        <w:t xml:space="preserve">, </w:t>
-      </w:r>
-      <w:proofErr w:type="spellStart"/>
-      <w:r>
-        <w:rPr>
-          <w:rFonts w:ascii="Times New Roman" w:hAnsi="Times New Roman" w:cs="Times New Roman"/>
-        </w:rPr>
-        <w:t>pătratul</w:t>
-      </w:r>
-      <w:proofErr w:type="spellEnd"/>
-      <w:r>
-        <w:rPr>
-          <w:rFonts w:ascii="Times New Roman" w:hAnsi="Times New Roman" w:cs="Times New Roman"/>
-        </w:rPr>
-        <w:t xml:space="preserve"> </w:t>
-      </w:r>
-      <w:proofErr w:type="spellStart"/>
-      <w:r>
-        <w:rPr>
-          <w:rFonts w:ascii="Times New Roman" w:hAnsi="Times New Roman" w:cs="Times New Roman"/>
-        </w:rPr>
-        <w:t>unui</w:t>
-      </w:r>
-      <w:proofErr w:type="spellEnd"/>
-      <w:r>
-        <w:rPr>
-          <w:rFonts w:ascii="Times New Roman" w:hAnsi="Times New Roman" w:cs="Times New Roman"/>
-        </w:rPr>
-        <w:t xml:space="preserve"> </w:t>
-      </w:r>
-      <w:proofErr w:type="spellStart"/>
-      <w:r>
-        <w:rPr>
-          <w:rFonts w:ascii="Times New Roman" w:hAnsi="Times New Roman" w:cs="Times New Roman"/>
-        </w:rPr>
-        <w:t>număr</w:t>
-      </w:r>
-      <w:proofErr w:type="spellEnd"/>
-      <w:r>
-        <w:rPr>
-          <w:rFonts w:ascii="Times New Roman" w:hAnsi="Times New Roman" w:cs="Times New Roman"/>
-        </w:rPr>
-        <w:t xml:space="preserve"> par </w:t>
-      </w:r>
-      <w:proofErr w:type="spellStart"/>
-      <w:r>
-        <w:rPr>
-          <w:rFonts w:ascii="Times New Roman" w:hAnsi="Times New Roman" w:cs="Times New Roman"/>
-        </w:rPr>
-        <w:t>este</w:t>
-      </w:r>
-      <w:proofErr w:type="spellEnd"/>
-      <w:r>
-        <w:rPr>
-          <w:rFonts w:ascii="Times New Roman" w:hAnsi="Times New Roman" w:cs="Times New Roman"/>
-        </w:rPr>
-        <w:t xml:space="preserve">, de </w:t>
-      </w:r>
-      <w:proofErr w:type="spellStart"/>
-      <w:r>
-        <w:rPr>
-          <w:rFonts w:ascii="Times New Roman" w:hAnsi="Times New Roman" w:cs="Times New Roman"/>
-        </w:rPr>
-        <w:t>asemenea</w:t>
-      </w:r>
-      <w:proofErr w:type="spellEnd"/>
-      <w:r>
-        <w:rPr>
-          <w:rFonts w:ascii="Times New Roman" w:hAnsi="Times New Roman" w:cs="Times New Roman"/>
-        </w:rPr>
         <w:t>, par.</w:t>
       </w:r>
-    </w:p>
-    <w:p>
-      <w:pPr>
-        <w:rPr>
-          <w:rFonts w:ascii="Times New Roman" w:hAnsi="Times New Roman" w:cs="Times New Roman"/>
-        </w:rPr>
-      </w:pPr>
     </w:p>
     <w:p>
       <w:pPr>
@@ -1111,18 +1142,486 @@
     </w:p>
     <w:p>
       <w:pPr>
-        <w:jc w:val="center"/>
-        <w:rPr>
-          <w:rFonts w:ascii="Times New Roman" w:hAnsi="Times New Roman" w:cs="Times New Roman"/>
-          <w:lang w:val="ro-RO"/>
-        </w:rPr>
-      </w:pPr>
-      <w:r>
-        <w:rPr>
-          <w:rFonts w:ascii="Times New Roman" w:hAnsi="Times New Roman" w:cs="Times New Roman"/>
-          <w:lang w:val="ro-RO"/>
-        </w:rPr>
-        <w:t xml:space="preserve"> </w:t>
+        <w:rPr>
+          <w:rFonts w:ascii="Times New Roman" w:hAnsi="Times New Roman" w:cs="Times New Roman"/>
+          <w:lang w:val="ro-RO"/>
+        </w:rPr>
+      </w:pPr>
+    </w:p>
+    <w:p>
+      <w:pPr>
+        <w:rPr>
+          <w:rFonts w:ascii="Times New Roman" w:hAnsi="Times New Roman" w:cs="Times New Roman"/>
+          <w:lang w:val="ro-RO"/>
+        </w:rPr>
+      </w:pPr>
+    </w:p>
+    <w:p>
+      <w:pPr>
+        <w:pStyle w:val="ListParagraph"/>
+        <w:numPr>
+          <w:ilvl w:val="0"/>
+          <w:numId w:val="2"/>
+        </w:numPr>
+        <w:rPr>
+          <w:rFonts w:ascii="Times New Roman" w:hAnsi="Times New Roman" w:cs="Times New Roman"/>
+          <w:b/>
+          <w:bCs/>
+          <w:sz w:val="28"/>
+          <w:szCs w:val="28"/>
+          <w:lang w:val="ro-RO"/>
+        </w:rPr>
+      </w:pPr>
+      <w:r>
+        <w:rPr>
+          <w:rFonts w:ascii="Times New Roman" w:hAnsi="Times New Roman" w:cs="Times New Roman"/>
+          <w:b/>
+          <w:bCs/>
+          <w:sz w:val="28"/>
+          <w:szCs w:val="28"/>
+          <w:lang w:val="ro-RO"/>
+        </w:rPr>
+        <w:t>Aspecte teoretice privind algoritmul</w:t>
+      </w:r>
+    </w:p>
+    <w:p>
+      <w:pPr>
+        <w:pStyle w:val="ListParagraph"/>
+        <w:rPr>
+          <w:rFonts w:ascii="Times New Roman" w:hAnsi="Times New Roman" w:cs="Times New Roman"/>
+          <w:b/>
+          <w:bCs/>
+          <w:sz w:val="28"/>
+          <w:szCs w:val="28"/>
+          <w:lang w:val="ro-RO"/>
+        </w:rPr>
+      </w:pPr>
+    </w:p>
+    <w:p>
+      <w:pPr>
+        <w:pStyle w:val="ListParagraph"/>
+        <w:numPr>
+          <w:ilvl w:val="1"/>
+          <w:numId w:val="2"/>
+        </w:numPr>
+        <w:rPr>
+          <w:rFonts w:ascii="Times New Roman" w:hAnsi="Times New Roman" w:cs="Times New Roman"/>
+          <w:b/>
+          <w:bCs/>
+          <w:lang w:val="ro-RO"/>
+        </w:rPr>
+      </w:pPr>
+      <w:r>
+        <w:rPr>
+          <w:rFonts w:ascii="Times New Roman" w:hAnsi="Times New Roman" w:cs="Times New Roman"/>
+          <w:b/>
+          <w:bCs/>
+          <w:lang w:val="ro-RO"/>
+        </w:rPr>
+        <w:t>Logica de ordinul I și inferența predicativă</w:t>
+      </w:r>
+    </w:p>
+    <w:p>
+      <w:pPr>
+        <w:ind w:left="720"/>
+        <w:rPr>
+          <w:rFonts w:ascii="Times New Roman" w:hAnsi="Times New Roman" w:cs="Times New Roman"/>
+          <w:lang w:val="ro-RO"/>
+        </w:rPr>
+      </w:pPr>
+      <w:r>
+        <w:rPr>
+          <w:rFonts w:ascii="Times New Roman" w:hAnsi="Times New Roman" w:cs="Times New Roman"/>
+          <w:lang w:val="ro-RO"/>
+        </w:rPr>
+        <w:t xml:space="preserve">Logica de ordinul I permite reprezentarea cunoștințelor sub formă de obiecte, proprietăți </w:t>
+      </w:r>
+    </w:p>
+    <w:p>
+      <w:pPr>
+        <w:rPr>
+          <w:rFonts w:ascii="Times New Roman" w:hAnsi="Times New Roman" w:cs="Times New Roman"/>
+          <w:lang w:val="ro-RO"/>
+        </w:rPr>
+      </w:pPr>
+      <w:r>
+        <w:rPr>
+          <w:rFonts w:ascii="Times New Roman" w:hAnsi="Times New Roman" w:cs="Times New Roman"/>
+          <w:lang w:val="ro-RO"/>
+        </w:rPr>
+        <w:t xml:space="preserve">și relații. Spre deosebire de logica propozițională, aceasta utilizează predicate cu argumente, variabile și constante. </w:t>
+      </w:r>
+    </w:p>
+    <w:p>
+      <w:pPr>
+        <w:rPr>
+          <w:rFonts w:ascii="Times New Roman" w:hAnsi="Times New Roman" w:cs="Times New Roman"/>
+          <w:lang w:val="ro-RO"/>
+        </w:rPr>
+      </w:pPr>
+      <w:r>
+        <w:rPr>
+          <w:rFonts w:ascii="Times New Roman" w:hAnsi="Times New Roman" w:cs="Times New Roman"/>
+          <w:lang w:val="ro-RO"/>
+        </w:rPr>
+        <w:t>În cadrul proiectului sunt utilizate:</w:t>
+      </w:r>
+    </w:p>
+    <w:p>
+      <w:pPr>
+        <w:pStyle w:val="ListParagraph"/>
+        <w:numPr>
+          <w:ilvl w:val="0"/>
+          <w:numId w:val="7"/>
+        </w:numPr>
+        <w:rPr>
+          <w:rFonts w:ascii="Times New Roman" w:hAnsi="Times New Roman" w:cs="Times New Roman"/>
+          <w:lang w:val="ro-RO"/>
+        </w:rPr>
+      </w:pPr>
+      <w:r>
+        <w:rPr>
+          <w:rFonts w:ascii="Times New Roman" w:hAnsi="Times New Roman" w:cs="Times New Roman"/>
+          <w:lang w:val="ro-RO"/>
+        </w:rPr>
+        <w:t>Constante: n, n2, t</w:t>
+      </w:r>
+    </w:p>
+    <w:p>
+      <w:pPr>
+        <w:pStyle w:val="ListParagraph"/>
+        <w:numPr>
+          <w:ilvl w:val="0"/>
+          <w:numId w:val="7"/>
+        </w:numPr>
+        <w:rPr>
+          <w:rFonts w:ascii="Times New Roman" w:hAnsi="Times New Roman" w:cs="Times New Roman"/>
+          <w:lang w:val="ro-RO"/>
+        </w:rPr>
+      </w:pPr>
+      <w:r>
+        <w:rPr>
+          <w:rFonts w:ascii="Times New Roman" w:hAnsi="Times New Roman" w:cs="Times New Roman"/>
+          <w:lang w:val="ro-RO"/>
+        </w:rPr>
+        <w:t>Variabile: ?X ?Y ?T</w:t>
+      </w:r>
+    </w:p>
+    <w:p>
+      <w:pPr>
+        <w:pStyle w:val="ListParagraph"/>
+        <w:numPr>
+          <w:ilvl w:val="0"/>
+          <w:numId w:val="7"/>
+        </w:numPr>
+        <w:rPr>
+          <w:rFonts w:ascii="Times New Roman" w:hAnsi="Times New Roman" w:cs="Times New Roman"/>
+          <w:lang w:val="ro-RO"/>
+        </w:rPr>
+      </w:pPr>
+      <w:r>
+        <w:rPr>
+          <w:rFonts w:ascii="Times New Roman" w:hAnsi="Times New Roman" w:cs="Times New Roman"/>
+          <w:lang w:val="ro-RO"/>
+        </w:rPr>
+        <w:t>Predicate: Par(x), Isoscel(t), Patrat(x,y)</w:t>
+      </w:r>
+    </w:p>
+    <w:p>
+      <w:pPr>
+        <w:pStyle w:val="ListParagraph"/>
+        <w:numPr>
+          <w:ilvl w:val="0"/>
+          <w:numId w:val="7"/>
+        </w:numPr>
+        <w:rPr>
+          <w:rFonts w:ascii="Times New Roman" w:hAnsi="Times New Roman" w:cs="Times New Roman"/>
+          <w:lang w:val="ro-RO"/>
+        </w:rPr>
+      </w:pPr>
+      <w:r>
+        <w:rPr>
+          <w:rFonts w:ascii="Times New Roman" w:hAnsi="Times New Roman" w:cs="Times New Roman"/>
+          <w:lang w:val="ro-RO"/>
+        </w:rPr>
+        <w:t>Reguli de inferență de tip IF-THEN</w:t>
+      </w:r>
+    </w:p>
+    <w:p>
+      <w:pPr>
+        <w:ind w:left="360"/>
+        <w:rPr>
+          <w:rFonts w:ascii="Times New Roman" w:hAnsi="Times New Roman" w:cs="Times New Roman"/>
+          <w:lang w:val="ro-RO"/>
+        </w:rPr>
+      </w:pPr>
+    </w:p>
+    <w:p>
+      <w:pPr>
+        <w:pStyle w:val="ListParagraph"/>
+        <w:numPr>
+          <w:ilvl w:val="1"/>
+          <w:numId w:val="2"/>
+        </w:numPr>
+        <w:rPr>
+          <w:rFonts w:ascii="Times New Roman" w:hAnsi="Times New Roman" w:cs="Times New Roman"/>
+          <w:b/>
+          <w:bCs/>
+          <w:lang w:val="ro-RO"/>
+        </w:rPr>
+      </w:pPr>
+      <w:r>
+        <w:rPr>
+          <w:rFonts w:ascii="Times New Roman" w:hAnsi="Times New Roman" w:cs="Times New Roman"/>
+          <w:b/>
+          <w:bCs/>
+          <w:lang w:val="ro-RO"/>
+        </w:rPr>
+        <w:t>Raționamentul înainte (Forword Chaining)</w:t>
+      </w:r>
+    </w:p>
+    <w:p>
+      <w:pPr>
+        <w:rPr>
+          <w:rFonts w:ascii="Times New Roman" w:hAnsi="Times New Roman" w:cs="Times New Roman"/>
+          <w:lang w:val="ro-RO"/>
+        </w:rPr>
+      </w:pPr>
+      <w:r>
+        <w:rPr>
+          <w:rFonts w:ascii="Times New Roman" w:hAnsi="Times New Roman" w:cs="Times New Roman"/>
+          <w:lang w:val="ro-RO"/>
+        </w:rPr>
+        <w:t>Este</w:t>
+      </w:r>
+      <w:r>
+        <w:rPr>
+          <w:rFonts w:ascii="Times New Roman" w:hAnsi="Times New Roman" w:cs="Times New Roman"/>
+          <w:lang w:val="ro-RO"/>
+        </w:rPr>
+        <w:t xml:space="preserve"> o metodă în care sistemul pronește de la fapte cunoscute și aplică regulile pentru a genera noi fapte. Procesul se repetă până nu mai pot fi deduse informații suplimentare.</w:t>
+      </w:r>
+    </w:p>
+    <w:p>
+      <w:pPr>
+        <w:rPr>
+          <w:rFonts w:ascii="Times New Roman" w:hAnsi="Times New Roman" w:cs="Times New Roman"/>
+          <w:lang w:val="ro-RO"/>
+        </w:rPr>
+      </w:pPr>
+      <w:r>
+        <w:rPr>
+          <w:rFonts w:ascii="Times New Roman" w:hAnsi="Times New Roman" w:cs="Times New Roman"/>
+          <w:lang w:val="ro-RO"/>
+        </w:rPr>
+        <w:t>Etapele algoritmului sunt:</w:t>
+      </w:r>
+    </w:p>
+    <w:p>
+      <w:pPr>
+        <w:rPr>
+          <w:rFonts w:ascii="Times New Roman" w:hAnsi="Times New Roman" w:cs="Times New Roman"/>
+          <w:lang w:val="ro-RO"/>
+        </w:rPr>
+      </w:pPr>
+      <w:r>
+        <w:rPr>
+          <w:rFonts w:ascii="Times New Roman" w:hAnsi="Times New Roman" w:cs="Times New Roman"/>
+          <w:lang w:val="ro-RO"/>
+        </w:rPr>
+        <w:t>- Portrivirea premiselor cu faptele existente</w:t>
+      </w:r>
+    </w:p>
+    <w:p>
+      <w:pPr>
+        <w:rPr>
+          <w:rFonts w:ascii="Times New Roman" w:hAnsi="Times New Roman" w:cs="Times New Roman"/>
+          <w:lang w:val="ro-RO"/>
+        </w:rPr>
+      </w:pPr>
+      <w:r>
+        <w:rPr>
+          <w:rFonts w:ascii="Times New Roman" w:hAnsi="Times New Roman" w:cs="Times New Roman"/>
+          <w:lang w:val="ro-RO"/>
+        </w:rPr>
+        <w:t>- Unificarea variabilelor</w:t>
+      </w:r>
+    </w:p>
+    <w:p>
+      <w:pPr>
+        <w:rPr>
+          <w:rFonts w:ascii="Times New Roman" w:hAnsi="Times New Roman" w:cs="Times New Roman"/>
+          <w:lang w:val="ro-RO"/>
+        </w:rPr>
+      </w:pPr>
+      <w:r>
+        <w:rPr>
+          <w:rFonts w:ascii="Times New Roman" w:hAnsi="Times New Roman" w:cs="Times New Roman"/>
+          <w:lang w:val="ro-RO"/>
+        </w:rPr>
+        <w:t>- Generarea concluziei</w:t>
+      </w:r>
+    </w:p>
+    <w:p>
+      <w:pPr>
+        <w:rPr>
+          <w:rFonts w:ascii="Times New Roman" w:hAnsi="Times New Roman" w:cs="Times New Roman"/>
+          <w:lang w:val="ro-RO"/>
+        </w:rPr>
+      </w:pPr>
+      <w:r>
+        <w:rPr>
+          <w:rFonts w:ascii="Times New Roman" w:hAnsi="Times New Roman" w:cs="Times New Roman"/>
+          <w:lang w:val="ro-RO"/>
+        </w:rPr>
+        <w:t>- Actualizarea bazei de fapte</w:t>
+      </w:r>
+    </w:p>
+    <w:p>
+      <w:pPr>
+        <w:ind w:firstLine="720"/>
+        <w:rPr>
+          <w:rFonts w:ascii="Times New Roman" w:hAnsi="Times New Roman" w:cs="Times New Roman"/>
+          <w:lang w:val="ro-RO"/>
+        </w:rPr>
+      </w:pPr>
+      <w:r>
+        <w:rPr>
+          <w:rFonts w:ascii="Times New Roman" w:hAnsi="Times New Roman" w:cs="Times New Roman"/>
+          <w:lang w:val="ro-RO"/>
+        </w:rPr>
+        <w:t>Exemplu:</w:t>
+      </w:r>
+    </w:p>
+    <w:p>
+      <w:pPr>
+        <w:rPr>
+          <w:rFonts w:ascii="Times New Roman" w:hAnsi="Times New Roman" w:cs="Times New Roman"/>
+          <w:lang w:val="ro-RO"/>
+        </w:rPr>
+      </w:pPr>
+      <w:r>
+        <w:rPr>
+          <w:noProof/>
+        </w:rPr>
+        <w:drawing>
+          <wp:inline distT="0" distB="0" distL="0" distR="0" wp14:anchorId="627322A6" wp14:editId="312D6A7E">
+            <wp:extent cx="5943600" cy="2115820"/>
+            <wp:effectExtent l="0" t="0" r="0" b="0"/>
+            <wp:docPr id="1028514849" name="Picture 1"/>
+            <wp:cNvGraphicFramePr>
+              <a:graphicFrameLocks xmlns:a="http://schemas.openxmlformats.org/drawingml/2006/main" noChangeAspect="1"/>
+            </wp:cNvGraphicFramePr>
+            <a:graphic xmlns:a="http://schemas.openxmlformats.org/drawingml/2006/main">
+              <a:graphicData uri="http://schemas.openxmlformats.org/drawingml/2006/picture">
+                <pic:pic xmlns:pic="http://schemas.openxmlformats.org/drawingml/2006/picture">
+                  <pic:nvPicPr>
+                    <pic:cNvPr id="1028514849" name=""/>
+                    <pic:cNvPicPr/>
+                  </pic:nvPicPr>
+                  <pic:blipFill>
+                    <a:blip r:embed="rId7"/>
+                    <a:stretch>
+                      <a:fillRect/>
+                    </a:stretch>
+                  </pic:blipFill>
+                  <pic:spPr>
+                    <a:xfrm>
+                      <a:off x="0" y="0"/>
+                      <a:ext cx="5943600" cy="2115820"/>
+                    </a:xfrm>
+                    <a:prstGeom prst="rect">
+                      <a:avLst/>
+                    </a:prstGeom>
+                  </pic:spPr>
+                </pic:pic>
+              </a:graphicData>
+            </a:graphic>
+          </wp:inline>
+        </w:drawing>
+      </w:r>
+    </w:p>
+    <w:p>
+      <w:pPr>
+        <w:pStyle w:val="ListParagraph"/>
+        <w:numPr>
+          <w:ilvl w:val="1"/>
+          <w:numId w:val="2"/>
+        </w:numPr>
+        <w:rPr>
+          <w:rFonts w:ascii="Times New Roman" w:hAnsi="Times New Roman" w:cs="Times New Roman"/>
+          <w:b/>
+          <w:bCs/>
+          <w:lang w:val="ro-RO"/>
+        </w:rPr>
+      </w:pPr>
+      <w:r>
+        <w:rPr>
+          <w:rFonts w:ascii="Times New Roman" w:hAnsi="Times New Roman" w:cs="Times New Roman"/>
+          <w:b/>
+          <w:bCs/>
+          <w:lang w:val="ro-RO"/>
+        </w:rPr>
+        <w:lastRenderedPageBreak/>
+        <w:t>Procesul de unifcare</w:t>
+      </w:r>
+    </w:p>
+    <w:p>
+      <w:pPr>
+        <w:rPr>
+          <w:rFonts w:ascii="Times New Roman" w:hAnsi="Times New Roman" w:cs="Times New Roman"/>
+          <w:lang w:val="ro-RO"/>
+        </w:rPr>
+      </w:pPr>
+      <w:r>
+        <w:rPr>
+          <w:rFonts w:ascii="Times New Roman" w:hAnsi="Times New Roman" w:cs="Times New Roman"/>
+          <w:lang w:val="ro-RO"/>
+        </w:rPr>
+        <w:t>Unificarea</w:t>
+      </w:r>
+      <w:r>
+        <w:rPr>
+          <w:rFonts w:ascii="Times New Roman" w:hAnsi="Times New Roman" w:cs="Times New Roman"/>
+          <w:lang w:val="ro-RO"/>
+        </w:rPr>
+        <w:t xml:space="preserve"> reprezintă mecanismul prin care variabilele din predicate sunt asociate cu valori concrete. Algoritmul de unificare verifică compatibilitatea dintre predicate și gestionează substituțiile necesare pentru deducerea concluziei.</w:t>
+      </w:r>
+    </w:p>
+    <w:p>
+      <w:pPr>
+        <w:rPr>
+          <w:rFonts w:ascii="Times New Roman" w:hAnsi="Times New Roman" w:cs="Times New Roman"/>
+          <w:lang w:val="ro-RO"/>
+        </w:rPr>
+      </w:pPr>
+    </w:p>
+    <w:p>
+      <w:pPr>
+        <w:pStyle w:val="ListParagraph"/>
+        <w:numPr>
+          <w:ilvl w:val="0"/>
+          <w:numId w:val="2"/>
+        </w:numPr>
+        <w:rPr>
+          <w:rFonts w:ascii="Times New Roman" w:hAnsi="Times New Roman" w:cs="Times New Roman"/>
+          <w:b/>
+          <w:bCs/>
+          <w:sz w:val="28"/>
+          <w:szCs w:val="28"/>
+          <w:lang w:val="ro-RO"/>
+        </w:rPr>
+      </w:pPr>
+      <w:r>
+        <w:rPr>
+          <w:rFonts w:ascii="Times New Roman" w:hAnsi="Times New Roman" w:cs="Times New Roman"/>
+          <w:b/>
+          <w:bCs/>
+          <w:sz w:val="28"/>
+          <w:szCs w:val="28"/>
+          <w:lang w:val="ro-RO"/>
+        </w:rPr>
+        <w:t>Modalitatea de rezolvare</w:t>
       </w:r>
     </w:p>
     <w:sectPr>
@@ -1277,6 +1776,127 @@
     </w:lvl>
   </w:abstractNum>
   <w:abstractNum w:abstractNumId="1" w15:restartNumberingAfterBreak="0">
+    <w:nsid w:val="03E753D7"/>
+    <w:multiLevelType w:val="multilevel"/>
+    <w:tmpl w:val="44FA8EB0"/>
+    <w:lvl w:ilvl="0">
+      <w:start w:val="1"/>
+      <w:numFmt w:val="decimal"/>
+      <w:lvlText w:val="%1."/>
+      <w:lvlJc w:val="left"/>
+      <w:pPr>
+        <w:ind w:left="720" w:hanging="360"/>
+      </w:pPr>
+      <w:rPr>
+        <w:rFonts w:hint="default"/>
+      </w:rPr>
+    </w:lvl>
+    <w:lvl w:ilvl="1">
+      <w:start w:val="1"/>
+      <w:numFmt w:val="decimal"/>
+      <w:isLgl/>
+      <w:lvlText w:val="%1.%2"/>
+      <w:lvlJc w:val="left"/>
+      <w:pPr>
+        <w:ind w:left="1080" w:hanging="360"/>
+      </w:pPr>
+      <w:rPr>
+        <w:rFonts w:hint="default"/>
+      </w:rPr>
+    </w:lvl>
+    <w:lvl w:ilvl="2">
+      <w:start w:val="1"/>
+      <w:numFmt w:val="decimal"/>
+      <w:isLgl/>
+      <w:lvlText w:val="%1.%2.%3"/>
+      <w:lvlJc w:val="left"/>
+      <w:pPr>
+        <w:ind w:left="1800" w:hanging="720"/>
+      </w:pPr>
+      <w:rPr>
+        <w:rFonts w:hint="default"/>
+      </w:rPr>
+    </w:lvl>
+    <w:lvl w:ilvl="3">
+      <w:start w:val="1"/>
+      <w:numFmt w:val="decimal"/>
+      <w:isLgl/>
+      <w:lvlText w:val="%1.%2.%3.%4"/>
+      <w:lvlJc w:val="left"/>
+      <w:pPr>
+        <w:ind w:left="2160" w:hanging="720"/>
+      </w:pPr>
+      <w:rPr>
+        <w:rFonts w:hint="default"/>
+      </w:rPr>
+    </w:lvl>
+    <w:lvl w:ilvl="4">
+      <w:start w:val="1"/>
+      <w:numFmt w:val="decimal"/>
+      <w:isLgl/>
+      <w:lvlText w:val="%1.%2.%3.%4.%5"/>
+      <w:lvlJc w:val="left"/>
+      <w:pPr>
+        <w:ind w:left="2880" w:hanging="1080"/>
+      </w:pPr>
+      <w:rPr>
+        <w:rFonts w:hint="default"/>
+      </w:rPr>
+    </w:lvl>
+    <w:lvl w:ilvl="5">
+      <w:start w:val="1"/>
+      <w:numFmt w:val="decimal"/>
+      <w:isLgl/>
+      <w:lvlText w:val="%1.%2.%3.%4.%5.%6"/>
+      <w:lvlJc w:val="left"/>
+      <w:pPr>
+        <w:ind w:left="3240" w:hanging="1080"/>
+      </w:pPr>
+      <w:rPr>
+        <w:rFonts w:hint="default"/>
+      </w:rPr>
+    </w:lvl>
+    <w:lvl w:ilvl="6">
+      <w:start w:val="1"/>
+      <w:numFmt w:val="decimal"/>
+      <w:isLgl/>
+      <w:lvlText w:val="%1.%2.%3.%4.%5.%6.%7"/>
+      <w:lvlJc w:val="left"/>
+      <w:pPr>
+        <w:ind w:left="3960" w:hanging="1440"/>
+      </w:pPr>
+      <w:rPr>
+        <w:rFonts w:hint="default"/>
+      </w:rPr>
+    </w:lvl>
+    <w:lvl w:ilvl="7">
+      <w:start w:val="1"/>
+      <w:numFmt w:val="decimal"/>
+      <w:isLgl/>
+      <w:lvlText w:val="%1.%2.%3.%4.%5.%6.%7.%8"/>
+      <w:lvlJc w:val="left"/>
+      <w:pPr>
+        <w:ind w:left="4320" w:hanging="1440"/>
+      </w:pPr>
+      <w:rPr>
+        <w:rFonts w:hint="default"/>
+      </w:rPr>
+    </w:lvl>
+    <w:lvl w:ilvl="8">
+      <w:start w:val="1"/>
+      <w:numFmt w:val="decimal"/>
+      <w:isLgl/>
+      <w:lvlText w:val="%1.%2.%3.%4.%5.%6.%7.%8.%9"/>
+      <w:lvlJc w:val="left"/>
+      <w:pPr>
+        <w:ind w:left="5040" w:hanging="1800"/>
+      </w:pPr>
+      <w:rPr>
+        <w:rFonts w:hint="default"/>
+      </w:rPr>
+    </w:lvl>
+  </w:abstractNum>
+  <w:abstractNum w:abstractNumId="2" w15:restartNumberingAfterBreak="0">
     <w:nsid w:val="0B195F17"/>
     <w:multiLevelType w:val="hybridMultilevel"/>
     <w:tmpl w:val="6A443E62"/>
@@ -1365,7 +1985,7 @@
       </w:pPr>
     </w:lvl>
   </w:abstractNum>
-  <w:abstractNum w:abstractNumId="2" w15:restartNumberingAfterBreak="0">
+  <w:abstractNum w:abstractNumId="3" w15:restartNumberingAfterBreak="0">
     <w:nsid w:val="441E7387"/>
     <w:multiLevelType w:val="hybridMultilevel"/>
     <w:tmpl w:val="ED7C61B6"/>
@@ -1454,11 +2074,210 @@
       </w:pPr>
     </w:lvl>
   </w:abstractNum>
-  <w:abstractNum w:abstractNumId="3" w15:restartNumberingAfterBreak="0">
+  <w:abstractNum w:abstractNumId="4" w15:restartNumberingAfterBreak="0">
+    <w:nsid w:val="51E454F8"/>
+    <w:multiLevelType w:val="hybridMultilevel"/>
+    <w:tmpl w:val="ECE6F4C4"/>
+    <w:lvl w:ilvl="0" w:tplc="04090001">
+      <w:start w:val="1"/>
+      <w:numFmt w:val="bullet"/>
+      <w:lvlText w:val=""/>
+      <w:lvlJc w:val="left"/>
+      <w:pPr>
+        <w:ind w:left="720" w:hanging="360"/>
+      </w:pPr>
+      <w:rPr>
+        <w:rFonts w:ascii="Symbol" w:hAnsi="Symbol" w:hint="default"/>
+      </w:rPr>
+    </w:lvl>
+    <w:lvl w:ilvl="1" w:tplc="04090003" w:tentative="1">
+      <w:start w:val="1"/>
+      <w:numFmt w:val="bullet"/>
+      <w:lvlText w:val="o"/>
+      <w:lvlJc w:val="left"/>
+      <w:pPr>
+        <w:ind w:left="1440" w:hanging="360"/>
+      </w:pPr>
+      <w:rPr>
+        <w:rFonts w:ascii="Courier New" w:hAnsi="Courier New" w:cs="Courier New" w:hint="default"/>
+      </w:rPr>
+    </w:lvl>
+    <w:lvl w:ilvl="2" w:tplc="04090005" w:tentative="1">
+      <w:start w:val="1"/>
+      <w:numFmt w:val="bullet"/>
+      <w:lvlText w:val=""/>
+      <w:lvlJc w:val="left"/>
+      <w:pPr>
+        <w:ind w:left="2160" w:hanging="360"/>
+      </w:pPr>
+      <w:rPr>
+        <w:rFonts w:ascii="Wingdings" w:hAnsi="Wingdings" w:hint="default"/>
+      </w:rPr>
+    </w:lvl>
+    <w:lvl w:ilvl="3" w:tplc="04090001" w:tentative="1">
+      <w:start w:val="1"/>
+      <w:numFmt w:val="bullet"/>
+      <w:lvlText w:val=""/>
+      <w:lvlJc w:val="left"/>
+      <w:pPr>
+        <w:ind w:left="2880" w:hanging="360"/>
+      </w:pPr>
+      <w:rPr>
+        <w:rFonts w:ascii="Symbol" w:hAnsi="Symbol" w:hint="default"/>
+      </w:rPr>
+    </w:lvl>
+    <w:lvl w:ilvl="4" w:tplc="04090003" w:tentative="1">
+      <w:start w:val="1"/>
+      <w:numFmt w:val="bullet"/>
+      <w:lvlText w:val="o"/>
+      <w:lvlJc w:val="left"/>
+      <w:pPr>
+        <w:ind w:left="3600" w:hanging="360"/>
+      </w:pPr>
+      <w:rPr>
+        <w:rFonts w:ascii="Courier New" w:hAnsi="Courier New" w:cs="Courier New" w:hint="default"/>
+      </w:rPr>
+    </w:lvl>
+    <w:lvl w:ilvl="5" w:tplc="04090005" w:tentative="1">
+      <w:start w:val="1"/>
+      <w:numFmt w:val="bullet"/>
+      <w:lvlText w:val=""/>
+      <w:lvlJc w:val="left"/>
+      <w:pPr>
+        <w:ind w:left="4320" w:hanging="360"/>
+      </w:pPr>
+      <w:rPr>
+        <w:rFonts w:ascii="Wingdings" w:hAnsi="Wingdings" w:hint="default"/>
+      </w:rPr>
+    </w:lvl>
+    <w:lvl w:ilvl="6" w:tplc="04090001" w:tentative="1">
+      <w:start w:val="1"/>
+      <w:numFmt w:val="bullet"/>
+      <w:lvlText w:val=""/>
+      <w:lvlJc w:val="left"/>
+      <w:pPr>
+        <w:ind w:left="5040" w:hanging="360"/>
+      </w:pPr>
+      <w:rPr>
+        <w:rFonts w:ascii="Symbol" w:hAnsi="Symbol" w:hint="default"/>
+      </w:rPr>
+    </w:lvl>
+    <w:lvl w:ilvl="7" w:tplc="04090003" w:tentative="1">
+      <w:start w:val="1"/>
+      <w:numFmt w:val="bullet"/>
+      <w:lvlText w:val="o"/>
+      <w:lvlJc w:val="left"/>
+      <w:pPr>
+        <w:ind w:left="5760" w:hanging="360"/>
+      </w:pPr>
+      <w:rPr>
+        <w:rFonts w:ascii="Courier New" w:hAnsi="Courier New" w:cs="Courier New" w:hint="default"/>
+      </w:rPr>
+    </w:lvl>
+    <w:lvl w:ilvl="8" w:tplc="04090005" w:tentative="1">
+      <w:start w:val="1"/>
+      <w:numFmt w:val="bullet"/>
+      <w:lvlText w:val=""/>
+      <w:lvlJc w:val="left"/>
+      <w:pPr>
+        <w:ind w:left="6480" w:hanging="360"/>
+      </w:pPr>
+      <w:rPr>
+        <w:rFonts w:ascii="Wingdings" w:hAnsi="Wingdings" w:hint="default"/>
+      </w:rPr>
+    </w:lvl>
+  </w:abstractNum>
+  <w:abstractNum w:abstractNumId="5" w15:restartNumberingAfterBreak="0">
+    <w:nsid w:val="66EE0594"/>
+    <w:multiLevelType w:val="multilevel"/>
+    <w:tmpl w:val="0409001F"/>
+    <w:lvl w:ilvl="0">
+      <w:start w:val="1"/>
+      <w:numFmt w:val="decimal"/>
+      <w:lvlText w:val="%1."/>
+      <w:lvlJc w:val="left"/>
+      <w:pPr>
+        <w:ind w:left="360" w:hanging="360"/>
+      </w:pPr>
+    </w:lvl>
+    <w:lvl w:ilvl="1">
+      <w:start w:val="1"/>
+      <w:numFmt w:val="decimal"/>
+      <w:lvlText w:val="%1.%2."/>
+      <w:lvlJc w:val="left"/>
+      <w:pPr>
+        <w:ind w:left="792" w:hanging="432"/>
+      </w:pPr>
+    </w:lvl>
+    <w:lvl w:ilvl="2">
+      <w:start w:val="1"/>
+      <w:numFmt w:val="decimal"/>
+      <w:lvlText w:val="%1.%2.%3."/>
+      <w:lvlJc w:val="left"/>
+      <w:pPr>
+        <w:ind w:left="1224" w:hanging="504"/>
+      </w:pPr>
+    </w:lvl>
+    <w:lvl w:ilvl="3">
+      <w:start w:val="1"/>
+      <w:numFmt w:val="decimal"/>
+      <w:lvlText w:val="%1.%2.%3.%4."/>
+      <w:lvlJc w:val="left"/>
+      <w:pPr>
+        <w:ind w:left="1728" w:hanging="648"/>
+      </w:pPr>
+    </w:lvl>
+    <w:lvl w:ilvl="4">
+      <w:start w:val="1"/>
+      <w:numFmt w:val="decimal"/>
+      <w:lvlText w:val="%1.%2.%3.%4.%5."/>
+      <w:lvlJc w:val="left"/>
+      <w:pPr>
+        <w:ind w:left="2232" w:hanging="792"/>
+      </w:pPr>
+    </w:lvl>
+    <w:lvl w:ilvl="5">
+      <w:start w:val="1"/>
+      <w:numFmt w:val="decimal"/>
+      <w:lvlText w:val="%1.%2.%3.%4.%5.%6."/>
+      <w:lvlJc w:val="left"/>
+      <w:pPr>
+        <w:ind w:left="2736" w:hanging="936"/>
+      </w:pPr>
+    </w:lvl>
+    <w:lvl w:ilvl="6">
+      <w:start w:val="1"/>
+      <w:numFmt w:val="decimal"/>
+      <w:lvlText w:val="%1.%2.%3.%4.%5.%6.%7."/>
+      <w:lvlJc w:val="left"/>
+      <w:pPr>
+        <w:ind w:left="3240" w:hanging="1080"/>
+      </w:pPr>
+    </w:lvl>
+    <w:lvl w:ilvl="7">
+      <w:start w:val="1"/>
+      <w:numFmt w:val="decimal"/>
+      <w:lvlText w:val="%1.%2.%3.%4.%5.%6.%7.%8."/>
+      <w:lvlJc w:val="left"/>
+      <w:pPr>
+        <w:ind w:left="3744" w:hanging="1224"/>
+      </w:pPr>
+    </w:lvl>
+    <w:lvl w:ilvl="8">
+      <w:start w:val="1"/>
+      <w:numFmt w:val="decimal"/>
+      <w:lvlText w:val="%1.%2.%3.%4.%5.%6.%7.%8.%9."/>
+      <w:lvlJc w:val="left"/>
+      <w:pPr>
+        <w:ind w:left="4320" w:hanging="1440"/>
+      </w:pPr>
+    </w:lvl>
+  </w:abstractNum>
+  <w:abstractNum w:abstractNumId="6" w15:restartNumberingAfterBreak="0">
     <w:nsid w:val="6B294B16"/>
-    <w:multiLevelType w:val="hybridMultilevel"/>
-    <w:tmpl w:val="AEE07928"/>
-    <w:lvl w:ilvl="0" w:tplc="0409000F">
+    <w:multiLevelType w:val="multilevel"/>
+    <w:tmpl w:val="44FA8EB0"/>
+    <w:lvl w:ilvl="0">
       <w:start w:val="1"/>
       <w:numFmt w:val="decimal"/>
       <w:lvlText w:val="%1."/>
@@ -1470,90 +2289,220 @@
         <w:rFonts w:hint="default"/>
       </w:rPr>
     </w:lvl>
-    <w:lvl w:ilvl="1" w:tplc="04090019" w:tentative="1">
-      <w:start w:val="1"/>
-      <w:numFmt w:val="lowerLetter"/>
-      <w:lvlText w:val="%2."/>
-      <w:lvlJc w:val="left"/>
-      <w:pPr>
-        <w:ind w:left="1440" w:hanging="360"/>
-      </w:pPr>
-    </w:lvl>
-    <w:lvl w:ilvl="2" w:tplc="0409001B" w:tentative="1">
-      <w:start w:val="1"/>
-      <w:numFmt w:val="lowerRoman"/>
-      <w:lvlText w:val="%3."/>
-      <w:lvlJc w:val="right"/>
-      <w:pPr>
-        <w:ind w:left="2160" w:hanging="180"/>
-      </w:pPr>
-    </w:lvl>
-    <w:lvl w:ilvl="3" w:tplc="0409000F" w:tentative="1">
-      <w:start w:val="1"/>
-      <w:numFmt w:val="decimal"/>
-      <w:lvlText w:val="%4."/>
-      <w:lvlJc w:val="left"/>
-      <w:pPr>
-        <w:ind w:left="2880" w:hanging="360"/>
-      </w:pPr>
-    </w:lvl>
-    <w:lvl w:ilvl="4" w:tplc="04090019" w:tentative="1">
-      <w:start w:val="1"/>
-      <w:numFmt w:val="lowerLetter"/>
-      <w:lvlText w:val="%5."/>
-      <w:lvlJc w:val="left"/>
-      <w:pPr>
-        <w:ind w:left="3600" w:hanging="360"/>
-      </w:pPr>
-    </w:lvl>
-    <w:lvl w:ilvl="5" w:tplc="0409001B" w:tentative="1">
-      <w:start w:val="1"/>
-      <w:numFmt w:val="lowerRoman"/>
-      <w:lvlText w:val="%6."/>
-      <w:lvlJc w:val="right"/>
-      <w:pPr>
-        <w:ind w:left="4320" w:hanging="180"/>
-      </w:pPr>
-    </w:lvl>
-    <w:lvl w:ilvl="6" w:tplc="0409000F" w:tentative="1">
-      <w:start w:val="1"/>
-      <w:numFmt w:val="decimal"/>
-      <w:lvlText w:val="%7."/>
-      <w:lvlJc w:val="left"/>
-      <w:pPr>
-        <w:ind w:left="5040" w:hanging="360"/>
-      </w:pPr>
-    </w:lvl>
-    <w:lvl w:ilvl="7" w:tplc="04090019" w:tentative="1">
-      <w:start w:val="1"/>
-      <w:numFmt w:val="lowerLetter"/>
-      <w:lvlText w:val="%8."/>
-      <w:lvlJc w:val="left"/>
-      <w:pPr>
-        <w:ind w:left="5760" w:hanging="360"/>
-      </w:pPr>
-    </w:lvl>
-    <w:lvl w:ilvl="8" w:tplc="0409001B" w:tentative="1">
-      <w:start w:val="1"/>
-      <w:numFmt w:val="lowerRoman"/>
-      <w:lvlText w:val="%9."/>
-      <w:lvlJc w:val="right"/>
-      <w:pPr>
-        <w:ind w:left="6480" w:hanging="180"/>
+    <w:lvl w:ilvl="1">
+      <w:start w:val="1"/>
+      <w:numFmt w:val="decimal"/>
+      <w:isLgl/>
+      <w:lvlText w:val="%1.%2"/>
+      <w:lvlJc w:val="left"/>
+      <w:pPr>
+        <w:ind w:left="1080" w:hanging="360"/>
+      </w:pPr>
+      <w:rPr>
+        <w:rFonts w:hint="default"/>
+      </w:rPr>
+    </w:lvl>
+    <w:lvl w:ilvl="2">
+      <w:start w:val="1"/>
+      <w:numFmt w:val="decimal"/>
+      <w:isLgl/>
+      <w:lvlText w:val="%1.%2.%3"/>
+      <w:lvlJc w:val="left"/>
+      <w:pPr>
+        <w:ind w:left="1800" w:hanging="720"/>
+      </w:pPr>
+      <w:rPr>
+        <w:rFonts w:hint="default"/>
+      </w:rPr>
+    </w:lvl>
+    <w:lvl w:ilvl="3">
+      <w:start w:val="1"/>
+      <w:numFmt w:val="decimal"/>
+      <w:isLgl/>
+      <w:lvlText w:val="%1.%2.%3.%4"/>
+      <w:lvlJc w:val="left"/>
+      <w:pPr>
+        <w:ind w:left="2160" w:hanging="720"/>
+      </w:pPr>
+      <w:rPr>
+        <w:rFonts w:hint="default"/>
+      </w:rPr>
+    </w:lvl>
+    <w:lvl w:ilvl="4">
+      <w:start w:val="1"/>
+      <w:numFmt w:val="decimal"/>
+      <w:isLgl/>
+      <w:lvlText w:val="%1.%2.%3.%4.%5"/>
+      <w:lvlJc w:val="left"/>
+      <w:pPr>
+        <w:ind w:left="2880" w:hanging="1080"/>
+      </w:pPr>
+      <w:rPr>
+        <w:rFonts w:hint="default"/>
+      </w:rPr>
+    </w:lvl>
+    <w:lvl w:ilvl="5">
+      <w:start w:val="1"/>
+      <w:numFmt w:val="decimal"/>
+      <w:isLgl/>
+      <w:lvlText w:val="%1.%2.%3.%4.%5.%6"/>
+      <w:lvlJc w:val="left"/>
+      <w:pPr>
+        <w:ind w:left="3240" w:hanging="1080"/>
+      </w:pPr>
+      <w:rPr>
+        <w:rFonts w:hint="default"/>
+      </w:rPr>
+    </w:lvl>
+    <w:lvl w:ilvl="6">
+      <w:start w:val="1"/>
+      <w:numFmt w:val="decimal"/>
+      <w:isLgl/>
+      <w:lvlText w:val="%1.%2.%3.%4.%5.%6.%7"/>
+      <w:lvlJc w:val="left"/>
+      <w:pPr>
+        <w:ind w:left="3960" w:hanging="1440"/>
+      </w:pPr>
+      <w:rPr>
+        <w:rFonts w:hint="default"/>
+      </w:rPr>
+    </w:lvl>
+    <w:lvl w:ilvl="7">
+      <w:start w:val="1"/>
+      <w:numFmt w:val="decimal"/>
+      <w:isLgl/>
+      <w:lvlText w:val="%1.%2.%3.%4.%5.%6.%7.%8"/>
+      <w:lvlJc w:val="left"/>
+      <w:pPr>
+        <w:ind w:left="4320" w:hanging="1440"/>
+      </w:pPr>
+      <w:rPr>
+        <w:rFonts w:hint="default"/>
+      </w:rPr>
+    </w:lvl>
+    <w:lvl w:ilvl="8">
+      <w:start w:val="1"/>
+      <w:numFmt w:val="decimal"/>
+      <w:isLgl/>
+      <w:lvlText w:val="%1.%2.%3.%4.%5.%6.%7.%8.%9"/>
+      <w:lvlJc w:val="left"/>
+      <w:pPr>
+        <w:ind w:left="5040" w:hanging="1800"/>
+      </w:pPr>
+      <w:rPr>
+        <w:rFonts w:hint="default"/>
+      </w:rPr>
+    </w:lvl>
+  </w:abstractNum>
+  <w:abstractNum w:abstractNumId="7" w15:restartNumberingAfterBreak="0">
+    <w:nsid w:val="6F903D1A"/>
+    <w:multiLevelType w:val="multilevel"/>
+    <w:tmpl w:val="0409001F"/>
+    <w:lvl w:ilvl="0">
+      <w:start w:val="1"/>
+      <w:numFmt w:val="decimal"/>
+      <w:lvlText w:val="%1."/>
+      <w:lvlJc w:val="left"/>
+      <w:pPr>
+        <w:ind w:left="360" w:hanging="360"/>
+      </w:pPr>
+    </w:lvl>
+    <w:lvl w:ilvl="1">
+      <w:start w:val="1"/>
+      <w:numFmt w:val="decimal"/>
+      <w:lvlText w:val="%1.%2."/>
+      <w:lvlJc w:val="left"/>
+      <w:pPr>
+        <w:ind w:left="792" w:hanging="432"/>
+      </w:pPr>
+    </w:lvl>
+    <w:lvl w:ilvl="2">
+      <w:start w:val="1"/>
+      <w:numFmt w:val="decimal"/>
+      <w:lvlText w:val="%1.%2.%3."/>
+      <w:lvlJc w:val="left"/>
+      <w:pPr>
+        <w:ind w:left="1224" w:hanging="504"/>
+      </w:pPr>
+    </w:lvl>
+    <w:lvl w:ilvl="3">
+      <w:start w:val="1"/>
+      <w:numFmt w:val="decimal"/>
+      <w:lvlText w:val="%1.%2.%3.%4."/>
+      <w:lvlJc w:val="left"/>
+      <w:pPr>
+        <w:ind w:left="1728" w:hanging="648"/>
+      </w:pPr>
+    </w:lvl>
+    <w:lvl w:ilvl="4">
+      <w:start w:val="1"/>
+      <w:numFmt w:val="decimal"/>
+      <w:lvlText w:val="%1.%2.%3.%4.%5."/>
+      <w:lvlJc w:val="left"/>
+      <w:pPr>
+        <w:ind w:left="2232" w:hanging="792"/>
+      </w:pPr>
+    </w:lvl>
+    <w:lvl w:ilvl="5">
+      <w:start w:val="1"/>
+      <w:numFmt w:val="decimal"/>
+      <w:lvlText w:val="%1.%2.%3.%4.%5.%6."/>
+      <w:lvlJc w:val="left"/>
+      <w:pPr>
+        <w:ind w:left="2736" w:hanging="936"/>
+      </w:pPr>
+    </w:lvl>
+    <w:lvl w:ilvl="6">
+      <w:start w:val="1"/>
+      <w:numFmt w:val="decimal"/>
+      <w:lvlText w:val="%1.%2.%3.%4.%5.%6.%7."/>
+      <w:lvlJc w:val="left"/>
+      <w:pPr>
+        <w:ind w:left="3240" w:hanging="1080"/>
+      </w:pPr>
+    </w:lvl>
+    <w:lvl w:ilvl="7">
+      <w:start w:val="1"/>
+      <w:numFmt w:val="decimal"/>
+      <w:lvlText w:val="%1.%2.%3.%4.%5.%6.%7.%8."/>
+      <w:lvlJc w:val="left"/>
+      <w:pPr>
+        <w:ind w:left="3744" w:hanging="1224"/>
+      </w:pPr>
+    </w:lvl>
+    <w:lvl w:ilvl="8">
+      <w:start w:val="1"/>
+      <w:numFmt w:val="decimal"/>
+      <w:lvlText w:val="%1.%2.%3.%4.%5.%6.%7.%8.%9."/>
+      <w:lvlJc w:val="left"/>
+      <w:pPr>
+        <w:ind w:left="4320" w:hanging="1440"/>
       </w:pPr>
     </w:lvl>
   </w:abstractNum>
   <w:num w:numId="1" w16cid:durableId="664281754">
-    <w:abstractNumId w:val="1"/>
+    <w:abstractNumId w:val="2"/>
   </w:num>
   <w:num w:numId="2" w16cid:durableId="488597741">
-    <w:abstractNumId w:val="3"/>
+    <w:abstractNumId w:val="6"/>
   </w:num>
   <w:num w:numId="3" w16cid:durableId="404763471">
     <w:abstractNumId w:val="0"/>
   </w:num>
   <w:num w:numId="4" w16cid:durableId="935482310">
-    <w:abstractNumId w:val="2"/>
+    <w:abstractNumId w:val="3"/>
+  </w:num>
+  <w:num w:numId="5" w16cid:durableId="1077899093">
+    <w:abstractNumId w:val="7"/>
+  </w:num>
+  <w:num w:numId="6" w16cid:durableId="67845796">
+    <w:abstractNumId w:val="5"/>
+  </w:num>
+  <w:num w:numId="7" w16cid:durableId="1962375688">
+    <w:abstractNumId w:val="4"/>
+  </w:num>
+  <w:num w:numId="8" w16cid:durableId="1596092947">
+    <w:abstractNumId w:val="1"/>
   </w:num>
 </w:numbering>
 </file>
@@ -2161,6 +3110,7 @@
   <w:style w:type="character" w:default="1" w:styleId="DefaultParagraphFont">
     <w:name w:val="Default Paragraph Font"/>
     <w:uiPriority w:val="1"/>
+    <w:semiHidden/>
     <w:unhideWhenUsed/>
   </w:style>
   <w:style w:type="table" w:default="1" w:styleId="TableNormal">

</xml_diff>